<commit_message>
Reduce PM/meeting hours: Phase 1 2-3, Phase 2 4-6, Phase 3 1-2
Total project estimate narrowed from 131-172 to 121-159 hours.

Co-Authored-By: Claude Opus 4.6 <noreply@anthropic.com>
</commit_message>
<xml_diff>
--- a/sales-productivity-initiative.docx
+++ b/sales-productivity-initiative.docx
@@ -2369,7 +2369,7 @@
               <w:rPr>
                 <w:sz w:val="19"/>
               </w:rPr>
-              <w:t>4–6</w:t>
+              <w:t>2–3</w:t>
             </w:r>
           </w:p>
         </w:tc>
@@ -2409,7 +2409,7 @@
                 <w:b/>
                 <w:sz w:val="19"/>
               </w:rPr>
-              <w:t>31–41</w:t>
+              <w:t>29–38</w:t>
             </w:r>
           </w:p>
         </w:tc>
@@ -3350,7 +3350,7 @@
               <w:rPr>
                 <w:sz w:val="19"/>
               </w:rPr>
-              <w:t>10–14</w:t>
+              <w:t>4–6</w:t>
             </w:r>
           </w:p>
         </w:tc>
@@ -3390,7 +3390,7 @@
                 <w:b/>
                 <w:sz w:val="19"/>
               </w:rPr>
-              <w:t>80–103</w:t>
+              <w:t>74–95</w:t>
             </w:r>
           </w:p>
         </w:tc>
@@ -3747,7 +3747,7 @@
               <w:rPr>
                 <w:sz w:val="19"/>
               </w:rPr>
-              <w:t>3–4</w:t>
+              <w:t>1–2</w:t>
             </w:r>
           </w:p>
         </w:tc>
@@ -3789,7 +3789,7 @@
                 <w:b/>
                 <w:sz w:val="19"/>
               </w:rPr>
-              <w:t>20–28</w:t>
+              <w:t>18–26</w:t>
             </w:r>
           </w:p>
         </w:tc>
@@ -4011,7 +4011,7 @@
               <w:rPr>
                 <w:sz w:val="19"/>
               </w:rPr>
-              <w:t>4–6</w:t>
+              <w:t>2–3</w:t>
             </w:r>
           </w:p>
         </w:tc>
@@ -4029,7 +4029,7 @@
               <w:rPr>
                 <w:sz w:val="19"/>
               </w:rPr>
-              <w:t>31–41</w:t>
+              <w:t>29–38</w:t>
             </w:r>
           </w:p>
         </w:tc>
@@ -4107,7 +4107,7 @@
               <w:rPr>
                 <w:sz w:val="19"/>
               </w:rPr>
-              <w:t>10–14</w:t>
+              <w:t>4–6</w:t>
             </w:r>
           </w:p>
         </w:tc>
@@ -4126,7 +4126,7 @@
               <w:rPr>
                 <w:sz w:val="19"/>
               </w:rPr>
-              <w:t>80–103</w:t>
+              <w:t>74–95</w:t>
             </w:r>
           </w:p>
         </w:tc>
@@ -4200,7 +4200,7 @@
               <w:rPr>
                 <w:sz w:val="19"/>
               </w:rPr>
-              <w:t>3–4</w:t>
+              <w:t>1–2</w:t>
             </w:r>
           </w:p>
         </w:tc>
@@ -4218,7 +4218,7 @@
               <w:rPr>
                 <w:sz w:val="19"/>
               </w:rPr>
-              <w:t>20–28</w:t>
+              <w:t>18–26</w:t>
             </w:r>
           </w:p>
         </w:tc>
@@ -4298,7 +4298,7 @@
                 <w:b/>
                 <w:sz w:val="19"/>
               </w:rPr>
-              <w:t>17–24</w:t>
+              <w:t>7–11</w:t>
             </w:r>
           </w:p>
         </w:tc>
@@ -4318,7 +4318,7 @@
                 <w:b/>
                 <w:sz w:val="19"/>
               </w:rPr>
-              <w:t>131–172</w:t>
+              <w:t>121–159</w:t>
             </w:r>
           </w:p>
         </w:tc>
@@ -4440,7 +4440,7 @@
               <w:rPr>
                 <w:sz w:val="19"/>
               </w:rPr>
-              <w:t>31–41</w:t>
+              <w:t>29–38</w:t>
             </w:r>
           </w:p>
         </w:tc>
@@ -4480,7 +4480,7 @@
               <w:rPr>
                 <w:sz w:val="19"/>
               </w:rPr>
-              <w:t>80–103</w:t>
+              <w:t>74–95</w:t>
             </w:r>
           </w:p>
         </w:tc>
@@ -4518,7 +4518,7 @@
               <w:rPr>
                 <w:sz w:val="19"/>
               </w:rPr>
-              <w:t>20–28</w:t>
+              <w:t>18–26</w:t>
             </w:r>
           </w:p>
         </w:tc>
@@ -4560,7 +4560,7 @@
                 <w:b/>
                 <w:sz w:val="19"/>
               </w:rPr>
-              <w:t>131–172</w:t>
+              <w:t>121–159</w:t>
             </w:r>
           </w:p>
         </w:tc>

</xml_diff>

<commit_message>
Tighten dev hour estimates to 20-hr spread (128-148), remove change log
Raised component lows to be more realistic. Total hours: 135-159.

Co-Authored-By: Claude Opus 4.6 <noreply@anthropic.com>
</commit_message>
<xml_diff>
--- a/sales-productivity-initiative.docx
+++ b/sales-productivity-initiative.docx
@@ -629,7 +629,7 @@
         <w:rPr>
           <w:b/>
         </w:rPr>
-        <w:t>Development estimate: 24–30 hours</w:t>
+        <w:t>Development estimate: 27–30 hours</w:t>
       </w:r>
       <w:r/>
     </w:p>
@@ -1179,7 +1179,7 @@
         <w:rPr>
           <w:b/>
         </w:rPr>
-        <w:t>Development estimate: 35–40 hours</w:t>
+        <w:t>Development estimate: 38–40 hours</w:t>
       </w:r>
       <w:r/>
     </w:p>
@@ -1295,7 +1295,7 @@
         <w:rPr>
           <w:b/>
         </w:rPr>
-        <w:t>Development estimate: 18–26 hours</w:t>
+        <w:t>Development estimate: 22–26 hours</w:t>
       </w:r>
       <w:r>
         <w:t xml:space="preserve"> (expanded from original 12–16 to include reverse venue lookup)</w:t>
@@ -1357,7 +1357,7 @@
         <w:rPr>
           <w:b/>
         </w:rPr>
-        <w:t>Development estimate: 12–16 hours</w:t>
+        <w:t>Development estimate: 13–16 hours</w:t>
       </w:r>
       <w:r/>
     </w:p>
@@ -1431,7 +1431,7 @@
         <w:rPr>
           <w:b/>
         </w:rPr>
-        <w:t>Development estimate: 15–18 hours</w:t>
+        <w:t>Development estimate: 18–21 hours</w:t>
       </w:r>
       <w:r/>
     </w:p>
@@ -2015,7 +2015,7 @@
                 <w:b/>
                 <w:sz w:val="19"/>
               </w:rPr>
-              <w:t>24–30</w:t>
+              <w:t>27–30</w:t>
             </w:r>
           </w:p>
         </w:tc>
@@ -2093,7 +2093,7 @@
               <w:rPr>
                 <w:sz w:val="19"/>
               </w:rPr>
-              <w:t>6–10</w:t>
+              <w:t>8–10</w:t>
             </w:r>
           </w:p>
         </w:tc>
@@ -2211,7 +2211,7 @@
               <w:rPr>
                 <w:sz w:val="19"/>
               </w:rPr>
-              <w:t>4–6</w:t>
+              <w:t>5–6</w:t>
             </w:r>
           </w:p>
         </w:tc>
@@ -2329,7 +2329,7 @@
                 <w:b/>
                 <w:sz w:val="19"/>
               </w:rPr>
-              <w:t>27–35</w:t>
+              <w:t>30–35</w:t>
             </w:r>
           </w:p>
         </w:tc>
@@ -2409,7 +2409,7 @@
                 <w:b/>
                 <w:sz w:val="19"/>
               </w:rPr>
-              <w:t>29–38</w:t>
+              <w:t>32–38</w:t>
             </w:r>
           </w:p>
         </w:tc>
@@ -2530,7 +2530,7 @@
                 <w:b/>
                 <w:sz w:val="19"/>
               </w:rPr>
-              <w:t>35–40</w:t>
+              <w:t>38–40</w:t>
             </w:r>
           </w:p>
         </w:tc>
@@ -2570,7 +2570,7 @@
               <w:rPr>
                 <w:sz w:val="19"/>
               </w:rPr>
-              <w:t>8–12</w:t>
+              <w:t>10–12</w:t>
             </w:r>
           </w:p>
         </w:tc>
@@ -2648,7 +2648,7 @@
               <w:rPr>
                 <w:sz w:val="19"/>
               </w:rPr>
-              <w:t>6–10</w:t>
+              <w:t>8–10</w:t>
             </w:r>
           </w:p>
         </w:tc>
@@ -2686,7 +2686,7 @@
               <w:rPr>
                 <w:sz w:val="19"/>
               </w:rPr>
-              <w:t>8–12</w:t>
+              <w:t>9–12</w:t>
             </w:r>
           </w:p>
         </w:tc>
@@ -2804,7 +2804,7 @@
                 <w:b/>
                 <w:sz w:val="19"/>
               </w:rPr>
-              <w:t>18–26</w:t>
+              <w:t>22–26</w:t>
             </w:r>
           </w:p>
         </w:tc>
@@ -2842,7 +2842,7 @@
               <w:rPr>
                 <w:sz w:val="19"/>
               </w:rPr>
-              <w:t>3–4</w:t>
+              <w:t>4–4</w:t>
             </w:r>
           </w:p>
         </w:tc>
@@ -2920,7 +2920,7 @@
               <w:rPr>
                 <w:sz w:val="19"/>
               </w:rPr>
-              <w:t>4–6</w:t>
+              <w:t>5–6</w:t>
             </w:r>
           </w:p>
         </w:tc>
@@ -2998,7 +2998,7 @@
               <w:rPr>
                 <w:sz w:val="19"/>
               </w:rPr>
-              <w:t>4–6</w:t>
+              <w:t>5–6</w:t>
             </w:r>
           </w:p>
         </w:tc>
@@ -3038,7 +3038,7 @@
               <w:rPr>
                 <w:sz w:val="19"/>
               </w:rPr>
-              <w:t>2–4</w:t>
+              <w:t>3–4</w:t>
             </w:r>
           </w:p>
         </w:tc>
@@ -3116,7 +3116,7 @@
                 <w:b/>
                 <w:sz w:val="19"/>
               </w:rPr>
-              <w:t>12–16</w:t>
+              <w:t>13–16</w:t>
             </w:r>
           </w:p>
         </w:tc>
@@ -3154,7 +3154,7 @@
               <w:rPr>
                 <w:sz w:val="19"/>
               </w:rPr>
-              <w:t>6–10</w:t>
+              <w:t>7–10</w:t>
             </w:r>
           </w:p>
         </w:tc>
@@ -3310,7 +3310,7 @@
                 <w:b/>
                 <w:sz w:val="19"/>
               </w:rPr>
-              <w:t>70–89</w:t>
+              <w:t>78–89</w:t>
             </w:r>
           </w:p>
         </w:tc>
@@ -3390,7 +3390,7 @@
                 <w:b/>
                 <w:sz w:val="19"/>
               </w:rPr>
-              <w:t>74–95</w:t>
+              <w:t>82–95</w:t>
             </w:r>
           </w:p>
         </w:tc>
@@ -3511,7 +3511,7 @@
                 <w:b/>
                 <w:sz w:val="19"/>
               </w:rPr>
-              <w:t>15–18</w:t>
+              <w:t>18–21</w:t>
             </w:r>
           </w:p>
         </w:tc>
@@ -3551,7 +3551,7 @@
               <w:rPr>
                 <w:sz w:val="19"/>
               </w:rPr>
-              <w:t>8–10</w:t>
+              <w:t>9–10</w:t>
             </w:r>
           </w:p>
         </w:tc>
@@ -3589,7 +3589,7 @@
               <w:rPr>
                 <w:sz w:val="19"/>
               </w:rPr>
-              <w:t>4–6</w:t>
+              <w:t>5–6</w:t>
             </w:r>
           </w:p>
         </w:tc>
@@ -3629,7 +3629,7 @@
               <w:rPr>
                 <w:sz w:val="19"/>
               </w:rPr>
-              <w:t>3–5</w:t>
+              <w:t>4–5</w:t>
             </w:r>
           </w:p>
         </w:tc>
@@ -3709,7 +3709,7 @@
                 <w:b/>
                 <w:sz w:val="19"/>
               </w:rPr>
-              <w:t>17–24</w:t>
+              <w:t>20–24</w:t>
             </w:r>
           </w:p>
         </w:tc>
@@ -3789,7 +3789,7 @@
                 <w:b/>
                 <w:sz w:val="19"/>
               </w:rPr>
-              <w:t>18–26</w:t>
+              <w:t>21–26</w:t>
             </w:r>
           </w:p>
         </w:tc>
@@ -3993,7 +3993,7 @@
               <w:rPr>
                 <w:sz w:val="19"/>
               </w:rPr>
-              <w:t>27–35</w:t>
+              <w:t>30–35</w:t>
             </w:r>
           </w:p>
         </w:tc>
@@ -4029,7 +4029,7 @@
               <w:rPr>
                 <w:sz w:val="19"/>
               </w:rPr>
-              <w:t>29–38</w:t>
+              <w:t>32–38</w:t>
             </w:r>
           </w:p>
         </w:tc>
@@ -4088,7 +4088,7 @@
               <w:rPr>
                 <w:sz w:val="19"/>
               </w:rPr>
-              <w:t>70–89</w:t>
+              <w:t>78–89</w:t>
             </w:r>
           </w:p>
         </w:tc>
@@ -4126,7 +4126,7 @@
               <w:rPr>
                 <w:sz w:val="19"/>
               </w:rPr>
-              <w:t>74–95</w:t>
+              <w:t>82–95</w:t>
             </w:r>
           </w:p>
         </w:tc>
@@ -4182,7 +4182,7 @@
               <w:rPr>
                 <w:sz w:val="19"/>
               </w:rPr>
-              <w:t>17–24</w:t>
+              <w:t>20–24</w:t>
             </w:r>
           </w:p>
         </w:tc>
@@ -4218,7 +4218,7 @@
               <w:rPr>
                 <w:sz w:val="19"/>
               </w:rPr>
-              <w:t>18–26</w:t>
+              <w:t>21–26</w:t>
             </w:r>
           </w:p>
         </w:tc>
@@ -4278,7 +4278,7 @@
                 <w:b/>
                 <w:sz w:val="19"/>
               </w:rPr>
-              <w:t>114–148</w:t>
+              <w:t>128–148</w:t>
             </w:r>
           </w:p>
         </w:tc>
@@ -4318,7 +4318,7 @@
                 <w:b/>
                 <w:sz w:val="19"/>
               </w:rPr>
-              <w:t>121–159</w:t>
+              <w:t>135–159</w:t>
             </w:r>
           </w:p>
         </w:tc>
@@ -4440,7 +4440,7 @@
               <w:rPr>
                 <w:sz w:val="19"/>
               </w:rPr>
-              <w:t>29–38</w:t>
+              <w:t>32–38</w:t>
             </w:r>
           </w:p>
         </w:tc>
@@ -4480,7 +4480,7 @@
               <w:rPr>
                 <w:sz w:val="19"/>
               </w:rPr>
-              <w:t>74–95</w:t>
+              <w:t>82–95</w:t>
             </w:r>
           </w:p>
         </w:tc>
@@ -4518,7 +4518,7 @@
               <w:rPr>
                 <w:sz w:val="19"/>
               </w:rPr>
-              <w:t>18–26</w:t>
+              <w:t>21–26</w:t>
             </w:r>
           </w:p>
         </w:tc>
@@ -4560,7 +4560,7 @@
                 <w:b/>
                 <w:sz w:val="19"/>
               </w:rPr>
-              <w:t>121–159</w:t>
+              <w:t>135–159</w:t>
             </w:r>
           </w:p>
         </w:tc>

</xml_diff>

<commit_message>
Remove demo prep line item from Phase 1, update totals to 133-156
Co-Authored-By: Claude Opus 4.6 <noreply@anthropic.com>
</commit_message>
<xml_diff>
--- a/sales-productivity-initiative.docx
+++ b/sales-productivity-initiative.docx
@@ -629,7 +629,7 @@
         <w:rPr>
           <w:b/>
         </w:rPr>
-        <w:t>Development estimate: 27–30 hours</w:t>
+        <w:t>Development estimate: 25–27 hours</w:t>
       </w:r>
       <w:r/>
     </w:p>
@@ -2015,7 +2015,7 @@
                 <w:b/>
                 <w:sz w:val="19"/>
               </w:rPr>
-              <w:t>27–30</w:t>
+              <w:t>25–27</w:t>
             </w:r>
           </w:p>
         </w:tc>
@@ -2231,7 +2231,7 @@
               <w:rPr>
                 <w:sz w:val="19"/>
               </w:rPr>
-              <w:t>Demo prep &amp; walkthrough with stakeholders</w:t>
+              <w:t>Cross-cutting (infra setup, config, API key management)</w:t>
             </w:r>
           </w:p>
         </w:tc>
@@ -2249,7 +2249,7 @@
               <w:rPr>
                 <w:sz w:val="19"/>
               </w:rPr>
-              <w:t>2–3</w:t>
+              <w:t>3–5</w:t>
             </w:r>
           </w:p>
         </w:tc>
@@ -2268,9 +2268,10 @@
             </w:r>
             <w:r>
               <w:rPr>
-                <w:sz w:val="19"/>
-              </w:rPr>
-              <w:t>Cross-cutting (infra setup, config, API key management)</w:t>
+                <w:b/>
+                <w:sz w:val="19"/>
+              </w:rPr>
+              <w:t>Phase 1 Development Subtotal</w:t>
             </w:r>
           </w:p>
         </w:tc>
@@ -2287,9 +2288,10 @@
             </w:r>
             <w:r>
               <w:rPr>
-                <w:sz w:val="19"/>
-              </w:rPr>
-              <w:t>3–5</w:t>
+                <w:b/>
+                <w:sz w:val="19"/>
+              </w:rPr>
+              <w:t>28–32</w:t>
             </w:r>
           </w:p>
         </w:tc>
@@ -2307,10 +2309,9 @@
             </w:r>
             <w:r>
               <w:rPr>
-                <w:b/>
-                <w:sz w:val="19"/>
-              </w:rPr>
-              <w:t>Phase 1 Development Subtotal</w:t>
+                <w:sz w:val="19"/>
+              </w:rPr>
+              <w:t>Project management, meetings, &amp; demos</w:t>
             </w:r>
           </w:p>
         </w:tc>
@@ -2326,10 +2327,9 @@
             </w:r>
             <w:r>
               <w:rPr>
-                <w:b/>
-                <w:sz w:val="19"/>
-              </w:rPr>
-              <w:t>30–35</w:t>
+                <w:sz w:val="19"/>
+              </w:rPr>
+              <w:t>2–3</w:t>
             </w:r>
           </w:p>
         </w:tc>
@@ -2348,9 +2348,10 @@
             </w:r>
             <w:r>
               <w:rPr>
-                <w:sz w:val="19"/>
-              </w:rPr>
-              <w:t>Project management, meetings, &amp; demos</w:t>
+                <w:b/>
+                <w:sz w:val="19"/>
+              </w:rPr>
+              <w:t>Phase 1 Total</w:t>
             </w:r>
           </w:p>
         </w:tc>
@@ -2367,49 +2368,10 @@
             </w:r>
             <w:r>
               <w:rPr>
-                <w:sz w:val="19"/>
-              </w:rPr>
-              <w:t>2–3</w:t>
-            </w:r>
-          </w:p>
-        </w:tc>
-      </w:tr>
-      <w:tr>
-        <w:tc>
-          <w:tcPr>
-            <w:tcW w:type="dxa" w:w="4320"/>
-          </w:tcPr>
-          <w:p>
-            <w:r>
-              <w:rPr>
-                <w:sz w:val="19"/>
-              </w:rPr>
-            </w:r>
-            <w:r>
-              <w:rPr>
                 <w:b/>
                 <w:sz w:val="19"/>
               </w:rPr>
-              <w:t>Phase 1 Total</w:t>
-            </w:r>
-          </w:p>
-        </w:tc>
-        <w:tc>
-          <w:tcPr>
-            <w:tcW w:type="dxa" w:w="4320"/>
-          </w:tcPr>
-          <w:p>
-            <w:r>
-              <w:rPr>
-                <w:sz w:val="19"/>
-              </w:rPr>
-            </w:r>
-            <w:r>
-              <w:rPr>
-                <w:b/>
-                <w:sz w:val="19"/>
-              </w:rPr>
-              <w:t>32–38</w:t>
+              <w:t>30–35</w:t>
             </w:r>
           </w:p>
         </w:tc>
@@ -3993,7 +3955,7 @@
               <w:rPr>
                 <w:sz w:val="19"/>
               </w:rPr>
-              <w:t>30–35</w:t>
+              <w:t>28–32</w:t>
             </w:r>
           </w:p>
         </w:tc>
@@ -4029,7 +3991,7 @@
               <w:rPr>
                 <w:sz w:val="19"/>
               </w:rPr>
-              <w:t>32–38</w:t>
+              <w:t>30–35</w:t>
             </w:r>
           </w:p>
         </w:tc>
@@ -4278,7 +4240,7 @@
                 <w:b/>
                 <w:sz w:val="19"/>
               </w:rPr>
-              <w:t>128–148</w:t>
+              <w:t>126–145</w:t>
             </w:r>
           </w:p>
         </w:tc>
@@ -4318,7 +4280,7 @@
                 <w:b/>
                 <w:sz w:val="19"/>
               </w:rPr>
-              <w:t>135–159</w:t>
+              <w:t>133–156</w:t>
             </w:r>
           </w:p>
         </w:tc>
@@ -4440,7 +4402,7 @@
               <w:rPr>
                 <w:sz w:val="19"/>
               </w:rPr>
-              <w:t>32–38</w:t>
+              <w:t>30–35</w:t>
             </w:r>
           </w:p>
         </w:tc>
@@ -4560,7 +4522,7 @@
                 <w:b/>
                 <w:sz w:val="19"/>
               </w:rPr>
-              <w:t>135–159</w:t>
+              <w:t>133–156</w:t>
             </w:r>
           </w:p>
         </w:tc>

</xml_diff>